<commit_message>
Add Certifications section and update CV with AI-RTA + MCRTA certs
</commit_message>
<xml_diff>
--- a/Ravi-Rajput-CV.docx
+++ b/Ravi-Rajput-CV.docx
@@ -2446,6 +2446,80 @@
     </w:p>
     <w:p>
       <w:pPr>
+        <w:spacing w:before="80" w:after="0"/>
+      </w:pPr>
+      <w:r>
+        <w:rPr>
+          <w:b/>
+          <w:i w:val="0"/>
+          <w:color w:val="1F3A5F"/>
+          <w:sz w:val="19"/>
+        </w:rPr>
+        <w:t>AI Red Team Analyst (AI-RTA)</w:t>
+      </w:r>
+      <w:r>
+        <w:rPr>
+          <w:b w:val="0"/>
+          <w:i w:val="0"/>
+          <w:color w:val="202020"/>
+          <w:sz w:val="19"/>
+        </w:rPr>
+        <w:t xml:space="preserve">  —  CyberWarFare Labs</w:t>
+      </w:r>
+    </w:p>
+    <w:p>
+      <w:pPr>
+        <w:spacing w:before="0" w:after="40"/>
+      </w:pPr>
+      <w:r>
+        <w:rPr>
+          <w:b w:val="0"/>
+          <w:i w:val="0"/>
+          <w:color w:val="595959"/>
+          <w:sz w:val="18"/>
+        </w:rPr>
+        <w:t>Issued Oct 2026  ·  Credential ID 6ad12ff1b6d122ea6a92ba7a</w:t>
+      </w:r>
+    </w:p>
+    <w:p>
+      <w:pPr>
+        <w:spacing w:before="80" w:after="0"/>
+      </w:pPr>
+      <w:r>
+        <w:rPr>
+          <w:b/>
+          <w:i w:val="0"/>
+          <w:color w:val="1F3A5F"/>
+          <w:sz w:val="19"/>
+        </w:rPr>
+        <w:t>Certified Multi-Cloud Red Team Analyst (MCRTA)</w:t>
+      </w:r>
+      <w:r>
+        <w:rPr>
+          <w:b w:val="0"/>
+          <w:i w:val="0"/>
+          <w:color w:val="202020"/>
+          <w:sz w:val="19"/>
+        </w:rPr>
+        <w:t xml:space="preserve">  —  CyberWarFare Labs</w:t>
+      </w:r>
+    </w:p>
+    <w:p>
+      <w:pPr>
+        <w:spacing w:before="0" w:after="40"/>
+      </w:pPr>
+      <w:r>
+        <w:rPr>
+          <w:b w:val="0"/>
+          <w:i w:val="0"/>
+          <w:color w:val="595959"/>
+          <w:sz w:val="18"/>
+        </w:rPr>
+        <w:t>Issued Oct 2026  ·  Credential ID 6ad12e20b6d122ea6a92b85a</w:t>
+      </w:r>
+    </w:p>
+    <w:p>
+      <w:pPr>
         <w:spacing w:before="120" w:after="80"/>
         <w:pBdr>
           <w:bottom w:val="single" w:sz="6" w:space="3" w:color="1F3A5F"/>

</xml_diff>